<commit_message>
Verbergen van Inspectie tegel en behouden van icoon voor Mijn aanvragen
</commit_message>
<xml_diff>
--- a/INSTALL.docx
+++ b/INSTALL.docx
@@ -2,7 +2,7 @@
 <file path=word/document.xml><?xml version="1.0" encoding="utf-8"?>
 <w:document xmlns:w="http://schemas.openxmlformats.org/wordprocessingml/2006/main" xmlns:m="http://schemas.openxmlformats.org/officeDocument/2006/math" xmlns:r="http://schemas.openxmlformats.org/officeDocument/2006/relationships" xmlns:o="urn:schemas-microsoft-com:office:office" xmlns:v="urn:schemas-microsoft-com:vml" xmlns:w10="urn:schemas-microsoft-com:office:word" xmlns:a="http://schemas.openxmlformats.org/drawingml/2006/main" xmlns:pic="http://schemas.openxmlformats.org/drawingml/2006/picture" xmlns:wp="http://schemas.openxmlformats.org/drawingml/2006/wordprocessingDrawing">
   <w:body>
-    <w:bookmarkStart w:id="28" w:name="installatiehandleiding-altrad-scaff-app"/>
+    <w:bookmarkStart w:id="29" w:name="installatiehandleiding-altrad-scaff-app"/>
     <w:p>
       <w:pPr>
         <w:pStyle w:val="Heading1"/>
@@ -1339,7 +1339,7 @@
     </w:p>
     <w:bookmarkEnd w:id="22"/>
     <w:bookmarkEnd w:id="23"/>
-    <w:bookmarkStart w:id="26" w:name="X6c6299ae8a37e29a248ecd379ba27a6aff8610e"/>
+    <w:bookmarkStart w:id="27" w:name="X6c6299ae8a37e29a248ecd379ba27a6aff8610e"/>
     <w:p>
       <w:pPr>
         <w:pStyle w:val="Heading2"/>
@@ -1369,7 +1369,7 @@
         <w:t xml:space="preserve">. Hierdoor kan de AI direct, snel en veilig met jouw lokale Oracle 23ai database praten zonder Docker-commando’s te hoeven genereren.</w:t>
       </w:r>
     </w:p>
-    <w:bookmarkStart w:id="25" w:name="installatiestappen"/>
+    <w:bookmarkStart w:id="26" w:name="installatiestappen"/>
     <w:p>
       <w:pPr>
         <w:pStyle w:val="Heading3"/>
@@ -1413,7 +1413,7 @@
         </w:numPr>
       </w:pPr>
       <w:r>
-        <w:t xml:space="preserve">Zoek in de VS Code extensies naar</w:t>
+        <w:t xml:space="preserve">Installeer de officiële</w:t>
       </w:r>
       <w:r>
         <w:t xml:space="preserve"> </w:t>
@@ -1426,10 +1426,95 @@
         <w:t xml:space="preserve">Oracle SQL Developer Extension for VS Code</w:t>
       </w:r>
       <w:r>
-        <w:t xml:space="preserve"> </w:t>
-      </w:r>
-      <w:r>
-        <w:t xml:space="preserve">en installeer deze.</w:t>
+        <w:t xml:space="preserve">. Je kunt dit op twee manieren doen:</w:t>
+      </w:r>
+    </w:p>
+    <w:p>
+      <w:pPr>
+        <w:pStyle w:val="Compact"/>
+        <w:numPr>
+          <w:ilvl w:val="1"/>
+          <w:numId w:val="1008"/>
+        </w:numPr>
+      </w:pPr>
+      <w:r>
+        <w:rPr>
+          <w:b/>
+          <w:bCs/>
+        </w:rPr>
+        <w:t xml:space="preserve">Via VS Code</w:t>
+      </w:r>
+      <w:r>
+        <w:t xml:space="preserve">: Open het</w:t>
+      </w:r>
+      <w:r>
+        <w:t xml:space="preserve"> </w:t>
+      </w:r>
+      <w:r>
+        <w:t xml:space="preserve">‘Extensions’</w:t>
+      </w:r>
+      <w:r>
+        <w:t xml:space="preserve"> </w:t>
+      </w:r>
+      <w:r>
+        <w:t xml:space="preserve">tabblad aan de linkerkant (of druk op</w:t>
+      </w:r>
+      <w:r>
+        <w:t xml:space="preserve"> </w:t>
+      </w:r>
+      <w:r>
+        <w:rPr>
+          <w:rStyle w:val="VerbatimChar"/>
+        </w:rPr>
+        <w:t xml:space="preserve">Ctrl+Shift+X</w:t>
+      </w:r>
+      <w:r>
+        <w:t xml:space="preserve">), zoek op</w:t>
+      </w:r>
+      <w:r>
+        <w:t xml:space="preserve"> </w:t>
+      </w:r>
+      <w:r>
+        <w:t xml:space="preserve">“Oracle SQL Developer”</w:t>
+      </w:r>
+      <w:r>
+        <w:t xml:space="preserve"> </w:t>
+      </w:r>
+      <w:r>
+        <w:t xml:space="preserve">en klik op installeren.</w:t>
+      </w:r>
+    </w:p>
+    <w:p>
+      <w:pPr>
+        <w:pStyle w:val="Compact"/>
+        <w:numPr>
+          <w:ilvl w:val="1"/>
+          <w:numId w:val="1008"/>
+        </w:numPr>
+      </w:pPr>
+      <w:r>
+        <w:rPr>
+          <w:b/>
+          <w:bCs/>
+        </w:rPr>
+        <w:t xml:space="preserve">Via de Marketplace</w:t>
+      </w:r>
+      <w:r>
+        <w:t xml:space="preserve">: Download hem direct via deze link:</w:t>
+      </w:r>
+      <w:r>
+        <w:t xml:space="preserve"> </w:t>
+      </w:r>
+      <w:hyperlink r:id="rId25">
+        <w:r>
+          <w:rPr>
+            <w:rStyle w:val="Hyperlink"/>
+          </w:rPr>
+          <w:t xml:space="preserve">Visual Studio Marketplace - Oracle SQL Developer</w:t>
+        </w:r>
+      </w:hyperlink>
+      <w:r>
+        <w:t xml:space="preserve">.</w:t>
       </w:r>
     </w:p>
     <w:p>
@@ -1461,7 +1546,7 @@
         <w:pStyle w:val="Compact"/>
         <w:numPr>
           <w:ilvl w:val="1"/>
-          <w:numId w:val="1008"/>
+          <w:numId w:val="1009"/>
         </w:numPr>
       </w:pPr>
       <w:r>
@@ -1507,7 +1592,7 @@
         <w:pStyle w:val="Compact"/>
         <w:numPr>
           <w:ilvl w:val="1"/>
-          <w:numId w:val="1008"/>
+          <w:numId w:val="1009"/>
         </w:numPr>
       </w:pPr>
       <w:r>
@@ -1535,7 +1620,7 @@
         <w:pStyle w:val="Compact"/>
         <w:numPr>
           <w:ilvl w:val="1"/>
-          <w:numId w:val="1008"/>
+          <w:numId w:val="1009"/>
         </w:numPr>
       </w:pPr>
       <w:r>
@@ -1563,7 +1648,7 @@
         <w:pStyle w:val="Compact"/>
         <w:numPr>
           <w:ilvl w:val="1"/>
-          <w:numId w:val="1008"/>
+          <w:numId w:val="1009"/>
         </w:numPr>
       </w:pPr>
       <w:r>
@@ -1623,9 +1708,9 @@
         </w:pict>
       </w:r>
     </w:p>
-    <w:bookmarkEnd w:id="25"/>
     <w:bookmarkEnd w:id="26"/>
-    <w:bookmarkStart w:id="27" w:name="X032d5eb886a2dfd0529532e0c10a5b06c1f8251"/>
+    <w:bookmarkEnd w:id="27"/>
+    <w:bookmarkStart w:id="28" w:name="X032d5eb886a2dfd0529532e0c10a5b06c1f8251"/>
     <w:p>
       <w:pPr>
         <w:pStyle w:val="Heading2"/>
@@ -1671,7 +1756,7 @@
         <w:pStyle w:val="Compact"/>
         <w:numPr>
           <w:ilvl w:val="0"/>
-          <w:numId w:val="1009"/>
+          <w:numId w:val="1010"/>
         </w:numPr>
       </w:pPr>
       <w:r>
@@ -1720,7 +1805,7 @@
         <w:pStyle w:val="Compact"/>
         <w:numPr>
           <w:ilvl w:val="0"/>
-          <w:numId w:val="1009"/>
+          <w:numId w:val="1010"/>
         </w:numPr>
       </w:pPr>
       <w:r>
@@ -1763,7 +1848,7 @@
         <w:pStyle w:val="Compact"/>
         <w:numPr>
           <w:ilvl w:val="0"/>
-          <w:numId w:val="1009"/>
+          <w:numId w:val="1010"/>
         </w:numPr>
       </w:pPr>
       <w:r>
@@ -1809,7 +1894,7 @@
         <w:pStyle w:val="Compact"/>
         <w:numPr>
           <w:ilvl w:val="0"/>
-          <w:numId w:val="1009"/>
+          <w:numId w:val="1010"/>
         </w:numPr>
       </w:pPr>
       <w:r>
@@ -1840,7 +1925,7 @@
         <w:pStyle w:val="Compact"/>
         <w:numPr>
           <w:ilvl w:val="0"/>
-          <w:numId w:val="1009"/>
+          <w:numId w:val="1010"/>
         </w:numPr>
       </w:pPr>
       <w:r>
@@ -1883,8 +1968,8 @@
         <w:t xml:space="preserve">(Export -&gt; AI bewerkt -&gt; Import) waarmee dit project wordt gebouwd.</w:t>
       </w:r>
     </w:p>
-    <w:bookmarkEnd w:id="27"/>
     <w:bookmarkEnd w:id="28"/>
+    <w:bookmarkEnd w:id="29"/>
     <w:sectPr>
       <w:footnotePr>
         <w:numRestart w:val="eachSect"/>
@@ -2346,6 +2431,9 @@
     <w:abstractNumId w:val="991"/>
   </w:num>
   <w:num w:numId="1009">
+    <w:abstractNumId w:val="991"/>
+  </w:num>
+  <w:num w:numId="1010">
     <w:abstractNumId w:val="99411"/>
     <w:lvlOverride w:ilvl="0">
       <w:startOverride w:val="1"/>

</xml_diff>